<commit_message>
Recria Ads: roteiros M0-M2 com marcação de página de cada slide, slides 1.4 e 2.4 alinhados
Co-Authored-By: Claude Opus 5.5 <noreply@anthropic.com>
Claude-Session: https://claude.ai/code/session_01RDM8d5cVD9w4uwiMSyLkgt
</commit_message>
<xml_diff>
--- a/agencia-recria/cursos/recria-ads/para-ler-e-gravar/Roteiros - Modulos 0 a 2.docx
+++ b/agencia-recria/cursos/recria-ads/para-ler-e-gravar/Roteiros - Modulos 0 a 2.docx
@@ -34,6 +34,32 @@
     <w:p>
       <w:r>
         <w:t>Liberados no dia da compra · gravar até 13/10 · 11 aulas</w:t>
+      </w:r>
+    </w:p>
+    <w:p>
+      <w:pPr>
+        <w:pStyle w:val="Heading2"/>
+      </w:pPr>
+      <w:r>
+        <w:rPr>
+          <w:color w:val="9A7424"/>
+        </w:rPr>
+        <w:t>Como usar com os slides</w:t>
+      </w:r>
+    </w:p>
+    <w:p>
+      <w:r>
+        <w:t xml:space="preserve">Cada aula tem o seu PDF de slides (pasta "slides"). No roteiro, toda vez que aparecer </w:t>
+      </w:r>
+      <w:r>
+        <w:rPr>
+          <w:b/>
+          <w:color w:val="5A4412"/>
+        </w:rPr>
+        <w:t>▶ PÁGINA N do slide</w:t>
+      </w:r>
+      <w:r>
+        <w:t>, passe para a página N. O número de marcações de cada aula é igual ao número de páginas do PDF daquela aula.</w:t>
       </w:r>
     </w:p>
     <w:p>
@@ -155,10 +181,10 @@
                 <w:b/>
                 <w:color w:val="5A4412"/>
               </w:rPr>
-              <w:t>[SLIDE]</w:t>
+              <w:t>▶ PÁGINA</w:t>
             </w:r>
             <w:r>
-              <w:t xml:space="preserve"> indicam quando o slide aparece ao seu lado na edição.</w:t>
+              <w:t xml:space="preserve"> indicam quando passar para a próxima página do slide.</w:t>
             </w:r>
           </w:p>
         </w:tc>
@@ -243,10 +269,10 @@
                 <w:b/>
                 <w:color w:val="5A4412"/>
               </w:rPr>
-              <w:t>[TELA]</w:t>
+              <w:t>▶ PÁGINA</w:t>
             </w:r>
             <w:r>
-              <w:t xml:space="preserve"> dizem o que está escrito em cada página do Canva.</w:t>
+              <w:t xml:space="preserve"> indicam quando passar a página no Canva.</w:t>
             </w:r>
           </w:p>
         </w:tc>
@@ -893,7 +919,10 @@
           <w:b/>
           <w:color w:val="5A4412"/>
         </w:rPr>
-        <w:t>[SLIDE 1: RECRIA ADS · Venda sem parecer aquele vendedor chato]</w:t>
+        <w:t>▶ PÁGINA 1 do slide</w:t>
+      </w:r>
+      <w:r>
+        <w:t xml:space="preserve"> · RECRIA ADS · Venda sem parecer aquele vendedor chato</w:t>
       </w:r>
     </w:p>
     <w:p>
@@ -927,7 +956,10 @@
           <w:b/>
           <w:color w:val="5A4412"/>
         </w:rPr>
-        <w:t>[SLIDE 2: Quem sou eu · Amanda · CEO da Agência Recria · +10 anos em marketing]</w:t>
+        <w:t>▶ PÁGINA 2 do slide</w:t>
+      </w:r>
+      <w:r>
+        <w:t xml:space="preserve"> · Quem sou eu · Amanda · CEO da Agência Recria · +10 anos em marketing</w:t>
       </w:r>
     </w:p>
     <w:p>
@@ -956,7 +988,10 @@
           <w:b/>
           <w:color w:val="5A4412"/>
         </w:rPr>
-        <w:t>[SLIDE 3: O que é o Recria Ads · a metodologia da Agência Recria, aberta para você]</w:t>
+        <w:t>▶ PÁGINA 3 do slide</w:t>
+      </w:r>
+      <w:r>
+        <w:t xml:space="preserve"> · O que é o Recria Ads · a metodologia da Agência Recria, aberta para você</w:t>
       </w:r>
     </w:p>
     <w:p>
@@ -980,7 +1015,10 @@
           <w:b/>
           <w:color w:val="5A4412"/>
         </w:rPr>
-        <w:t>[SLIDE 4: Com o que você sai · conteúdo sem cara de anúncio · ganchos · estratégia · calendário com IA · Plano de 30 dias]</w:t>
+        <w:t>▶ PÁGINA 4 do slide</w:t>
+      </w:r>
+      <w:r>
+        <w:t xml:space="preserve"> · Com o que você sai · conteúdo sem cara de anúncio · ganchos · estratégia · calendário com IA · Plano de 30 dias</w:t>
       </w:r>
     </w:p>
     <w:p>
@@ -991,6 +1029,18 @@
     <w:p>
       <w:r>
         <w:t>Você sai sabendo criar conteúdo sem cara de anúncio. Sai com um banco de ganchos. Sai com a sua estratégia clara. Sai com o seu calendário de conteúdo montado com ajuda da inteligência artificial. E sai com o seu Plano de 30 dias pronto para aplicar.</w:t>
+      </w:r>
+    </w:p>
+    <w:p>
+      <w:r>
+        <w:rPr>
+          <w:b/>
+          <w:color w:val="5A4412"/>
+        </w:rPr>
+        <w:t>▶ PÁGINA 5 do slide</w:t>
+      </w:r>
+      <w:r>
+        <w:t xml:space="preserve"> · Próxima aula: como aproveitar o curso de verdade</w:t>
       </w:r>
     </w:p>
     <w:p>
@@ -1012,7 +1062,7 @@
         <w:t>🅱️ Plano B (se não der para aparecer):</w:t>
       </w:r>
       <w:r>
-        <w:t xml:space="preserve"> grave como 🖥️ Voz + Canva. Os mesmos textos dos [SLIDE] viram as páginas do Canva, e você lê o mesmo roteiro narrando. A entrega fica igual.</w:t>
+        <w:t xml:space="preserve"> grave como 🖥️ Voz + Canva. Use os slides desta aula no Canva e leia o mesmo roteiro, passando a página em cada ▶ PÁGINA. A entrega fica igual.</w:t>
       </w:r>
     </w:p>
     <w:p>
@@ -1058,11 +1108,35 @@
     </w:p>
     <w:p>
       <w:r>
+        <w:rPr>
+          <w:b/>
+          <w:color w:val="5A4412"/>
+        </w:rPr>
+        <w:t>▶ PÁGINA 1 do slide</w:t>
+      </w:r>
+      <w:r>
+        <w:t xml:space="preserve"> · Comece por aqui</w:t>
+      </w:r>
+    </w:p>
+    <w:p>
+      <w:r>
         <w:t>Eu sei que você é dono ou dona de negócio. E eu sei que você não tem tempo sobrando.</w:t>
       </w:r>
     </w:p>
     <w:p>
       <w:r>
+        <w:rPr>
+          <w:b/>
+          <w:color w:val="5A4412"/>
+        </w:rPr>
+        <w:t>▶ PÁGINA 2 do slide</w:t>
+      </w:r>
+      <w:r>
+        <w:t xml:space="preserve"> · 10 minutos por dia</w:t>
+      </w:r>
+    </w:p>
+    <w:p>
+      <w:r>
         <w:t>Então o único compromisso que eu te peço aqui é este: 10 minutos por dia.</w:t>
       </w:r>
     </w:p>
@@ -1073,11 +1147,35 @@
     </w:p>
     <w:p>
       <w:r>
+        <w:rPr>
+          <w:b/>
+          <w:color w:val="5A4412"/>
+        </w:rPr>
+        <w:t>▶ PÁGINA 3 do slide</w:t>
+      </w:r>
+      <w:r>
+        <w:t xml:space="preserve"> · Coloque na sua agenda</w:t>
+      </w:r>
+    </w:p>
+    <w:p>
+      <w:r>
         <w:t>Dez minutos por dia, todos os dias, valem muito mais do que cinco horas num domingo que nunca chega. Então eu te peço: pega a sua agenda agora e coloca esses 10 minutos como um compromisso com o seu negócio. Pode ser no café da manhã, antes de abrir a loja, no intervalo do almoço. O horário você escolhe. O importante é ser todo dia.</w:t>
       </w:r>
     </w:p>
     <w:p>
       <w:r>
+        <w:rPr>
+          <w:b/>
+          <w:color w:val="5A4412"/>
+        </w:rPr>
+        <w:t>▶ PÁGINA 4 do slide</w:t>
+      </w:r>
+      <w:r>
+        <w:t xml:space="preserve"> · 1 módulo novo por semana</w:t>
+      </w:r>
+    </w:p>
+    <w:p>
+      <w:r>
         <w:t>Agora deixa eu te explicar como o curso funciona.</w:t>
       </w:r>
     </w:p>
@@ -1088,6 +1186,18 @@
     </w:p>
     <w:p>
       <w:r>
+        <w:rPr>
+          <w:b/>
+          <w:color w:val="5A4412"/>
+        </w:rPr>
+        <w:t>▶ PÁGINA 5 do slide</w:t>
+      </w:r>
+      <w:r>
+        <w:t xml:space="preserve"> · Obesidade mental</w:t>
+      </w:r>
+    </w:p>
+    <w:p>
+      <w:r>
         <w:t>E eu fiz assim de propósito. Sabe por quê? Porque ninguém aprende maratonando dez aulas seguidas. Nós assistimos, achamos tudo incrível, e dois dias depois esquecemos metade. E, pior, não aplicamos nada.</w:t>
       </w:r>
     </w:p>
@@ -1098,6 +1208,18 @@
     </w:p>
     <w:p>
       <w:r>
+        <w:rPr>
+          <w:b/>
+          <w:color w:val="5A4412"/>
+        </w:rPr>
+        <w:t>▶ PÁGINA 6 do slide</w:t>
+      </w:r>
+      <w:r>
+        <w:t xml:space="preserve"> · Aprende, aplica, evolui</w:t>
+      </w:r>
+    </w:p>
+    <w:p>
+      <w:r>
         <w:t>Aqui é diferente. Você assiste a aula, faz a atividade, aplica no seu negócio no dia seguinte e só depois segue para a próxima. Aprende e aplica. Aprende e aplica.</w:t>
       </w:r>
     </w:p>
@@ -1108,11 +1230,35 @@
     </w:p>
     <w:p>
       <w:r>
+        <w:rPr>
+          <w:b/>
+          <w:color w:val="5A4412"/>
+        </w:rPr>
+        <w:t>▶ PÁGINA 7 do slide</w:t>
+      </w:r>
+      <w:r>
+        <w:t xml:space="preserve"> · Em cerca de 1 mês</w:t>
+      </w:r>
+    </w:p>
+    <w:p>
+      <w:r>
         <w:t>E aonde isso te leva? Em cerca de um mês, você vai estar com tudo o que aprendeu aqui condensado, aprofundado e aplicado no seu negócio. Conteúdo sem cara de anúncio, o seu calendário pronto e o seu Plano de 30 dias. Pronto ou pronta para engajar mais e vender sem parecer vendedor chato.</w:t>
       </w:r>
     </w:p>
     <w:p>
       <w:r>
+        <w:rPr>
+          <w:b/>
+          <w:color w:val="5A4412"/>
+        </w:rPr>
+        <w:t>▶ PÁGINA 8 do slide</w:t>
+      </w:r>
+      <w:r>
+        <w:t xml:space="preserve"> · Dicas</w:t>
+      </w:r>
+    </w:p>
+    <w:p>
+      <w:r>
         <w:t>Algumas dicas práticas para você aproveitar melhor:</w:t>
       </w:r>
     </w:p>
@@ -1143,6 +1289,18 @@
     </w:p>
     <w:p>
       <w:r>
+        <w:rPr>
+          <w:b/>
+          <w:color w:val="5A4412"/>
+        </w:rPr>
+        <w:t>▶ PÁGINA 9 do slide</w:t>
+      </w:r>
+      <w:r>
+        <w:t xml:space="preserve"> · Suporte</w:t>
+      </w:r>
+    </w:p>
+    <w:p>
+      <w:r>
         <w:t>E tem mais: você vai fazer parte do grupo do WhatsApp do curso. É um grupo fechado, em que eu e a minha equipe compartilhamos conteúdos novos, bastidores e avisos. E, normalmente uma vez por semana, ele é aberto para dúvidas e interações. É mais um canal de suporte e dúvidas, além da sala de aula virtual. O link está aqui embaixo da aula.</w:t>
       </w:r>
     </w:p>
@@ -1154,6 +1312,18 @@
     <w:p>
       <w:r>
         <w:t>E uma coisa importante: você tem 1 ano de acesso ao Recria Ads. Seguindo 10 minutos por dia, você termina em cerca de um mês. E ainda tem mais 11 meses para rever, consultar e reconsultar as aulas sempre que precisar.</w:t>
+      </w:r>
+    </w:p>
+    <w:p>
+      <w:r>
+        <w:rPr>
+          <w:b/>
+          <w:color w:val="5A4412"/>
+        </w:rPr>
+        <w:t>▶ PÁGINA 10 do slide</w:t>
+      </w:r>
+      <w:r>
+        <w:t xml:space="preserve"> · Não maratone</w:t>
       </w:r>
     </w:p>
     <w:p>
@@ -1180,87 +1350,7 @@
         <w:t>🅱️ Plano B (se não der para aparecer):</w:t>
       </w:r>
       <w:r>
-        <w:t xml:space="preserve"> grave como 🖥️ Voz + Canva, lendo o mesmo texto. Páginas do Canva, na ordem da fala:</w:t>
-      </w:r>
-    </w:p>
-    <w:p>
-      <w:pPr>
-        <w:pStyle w:val="ListNumber"/>
-      </w:pPr>
-      <w:r>
-        <w:t>O compromisso: 10 minutos por dia</w:t>
-      </w:r>
-    </w:p>
-    <w:p>
-      <w:pPr>
-        <w:pStyle w:val="ListNumber"/>
-      </w:pPr>
-      <w:r>
-        <w:t>Coloque na agenda: café da manhã, antes de abrir, intervalo do almoço</w:t>
-      </w:r>
-    </w:p>
-    <w:p>
-      <w:pPr>
-        <w:pStyle w:val="ListNumber"/>
-      </w:pPr>
-      <w:r>
-        <w:t>1 módulo por semana + atividades práticas</w:t>
-      </w:r>
-    </w:p>
-    <w:p>
-      <w:pPr>
-        <w:pStyle w:val="ListNumber"/>
-      </w:pPr>
-      <w:r>
-        <w:t>Obesidade mental: encher a cabeça e não aplicar nada</w:t>
-      </w:r>
-    </w:p>
-    <w:p>
-      <w:pPr>
-        <w:pStyle w:val="ListNumber"/>
-      </w:pPr>
-      <w:r>
-        <w:t>Aprende → aplica → evolui</w:t>
-      </w:r>
-    </w:p>
-    <w:p>
-      <w:pPr>
-        <w:pStyle w:val="ListNumber"/>
-      </w:pPr>
-      <w:r>
-        <w:t>Em cerca de 1 mês: tudo condensado, aprofundado e aplicado</w:t>
-      </w:r>
-    </w:p>
-    <w:p>
-      <w:pPr>
-        <w:pStyle w:val="ListNumber"/>
-      </w:pPr>
-      <w:r>
-        <w:t>5 dicas: caderno "Meu Recria Ads" · computador · 1,25x · materiais anexados · "Como adaptar"</w:t>
-      </w:r>
-    </w:p>
-    <w:p>
-      <w:pPr>
-        <w:pStyle w:val="ListNumber"/>
-      </w:pPr>
-      <w:r>
-        <w:t>Grupo do WhatsApp do curso + suporte nos comentários</w:t>
-      </w:r>
-    </w:p>
-    <w:p>
-      <w:pPr>
-        <w:pStyle w:val="ListNumber"/>
-      </w:pPr>
-      <w:r>
-        <w:t>1 ano de acesso: termina em 1 mês, e mais 11 meses para rever</w:t>
-      </w:r>
-    </w:p>
-    <w:p>
-      <w:pPr>
-        <w:pStyle w:val="ListNumber"/>
-      </w:pPr>
-      <w:r>
-        <w:t>Combinado: não maratone · feito é melhor do que perfeito</w:t>
+        <w:t xml:space="preserve"> grave como 🖥️ Voz + Canva com os slides desta aula, lendo o mesmo texto e passando a página em cada ▶ PÁGINA.</w:t>
       </w:r>
     </w:p>
     <w:p>
@@ -1361,7 +1451,27 @@
           <w:b/>
           <w:color w:val="5A4412"/>
         </w:rPr>
-        <w:t>[TELA: a Ficha "Meu cenário" aberta]</w:t>
+        <w:t>🖥️ Mude para a tela: a Ficha "Meu cenário" aberta</w:t>
+      </w:r>
+    </w:p>
+    <w:p>
+      <w:r>
+        <w:rPr>
+          <w:b/>
+          <w:color w:val="5A4412"/>
+        </w:rPr>
+        <w:t>▶ PÁGINA 1 do slide</w:t>
+      </w:r>
+      <w:r>
+        <w:t xml:space="preserve"> · Capa: O seu cenário + 30 ideias hoje</w:t>
+      </w:r>
+    </w:p>
+    <w:p>
+      <w:r>
+        <w:rPr>
+          <w:i/>
+        </w:rPr>
+        <w:t>(Fale a abertura com o slide na tela e, em "Esta aqui é a Ficha", mude para a ficha.)</w:t>
       </w:r>
     </w:p>
     <w:p>
@@ -1414,7 +1524,10 @@
           <w:b/>
           <w:color w:val="5A4412"/>
         </w:rPr>
-        <w:t>[TELA: os 7 cenários]</w:t>
+        <w:t>▶ PÁGINA 2 do slide</w:t>
+      </w:r>
+      <w:r>
+        <w:t xml:space="preserve"> · Os 7 cenários (volte para os slides)</w:t>
       </w:r>
     </w:p>
     <w:p>
@@ -1489,7 +1602,7 @@
           <w:b/>
           <w:color w:val="5A4412"/>
         </w:rPr>
-        <w:t>[TELA: Claude ou ChatGPT aberto]</w:t>
+        <w:t>🖥️ Mude para a tela: Claude ou ChatGPT aberto</w:t>
       </w:r>
     </w:p>
     <w:p>
@@ -1532,26 +1645,41 @@
     </w:p>
     <w:p>
       <w:r>
-        <w:t>Agora presta atenção, porque essa parte é a mais importante: a IA não conhece o seu negócio. Quem conhece é você.</w:t>
-      </w:r>
-    </w:p>
-    <w:p>
-      <w:r>
-        <w:t>Então eu não vou aceitar tudo. Vou olhar com olho crítico. Esta aqui eu manteria, porque é um bastidor real e as pessoas adoram ver o bolo sendo montado. Esta aqui eu cortaria, porque ficou genérica, poderia ser de qualquer doceria do Brasil. E esta aqui eu ajustaria, trocando o exemplo por uma história que realmente aconteceu na loja.</w:t>
-      </w:r>
-    </w:p>
-    <w:p>
-      <w:r>
-        <w:t>Quanto melhor a sua ficha, melhor a resposta. Se a resposta veio genérica, volta na ficha e coloca mais detalhes.</w:t>
-      </w:r>
-    </w:p>
-    <w:p>
-      <w:r>
         <w:rPr>
           <w:b/>
           <w:color w:val="5A4412"/>
         </w:rPr>
-        <w:t>[TELA: a atividade]</w:t>
+        <w:t>▶ PÁGINA 3 do slide</w:t>
+      </w:r>
+      <w:r>
+        <w:t xml:space="preserve"> · A regra de ouro (volte para os slides)</w:t>
+      </w:r>
+    </w:p>
+    <w:p>
+      <w:r>
+        <w:t>Agora presta atenção, porque essa parte é a mais importante: a IA não conhece o seu negócio. Quem conhece é você.</w:t>
+      </w:r>
+    </w:p>
+    <w:p>
+      <w:r>
+        <w:t>Então eu não vou aceitar tudo. Vou olhar com olho crítico. Esta aqui eu manteria, porque é um bastidor real e as pessoas adoram ver o bolo sendo montado. Esta aqui eu cortaria, porque ficou genérica, poderia ser de qualquer doceria do Brasil. E esta aqui eu ajustaria, trocando o exemplo por uma história que realmente aconteceu na loja.</w:t>
+      </w:r>
+    </w:p>
+    <w:p>
+      <w:r>
+        <w:t>Quanto melhor a sua ficha, melhor a resposta. Se a resposta veio genérica, volta na ficha e coloca mais detalhes.</w:t>
+      </w:r>
+    </w:p>
+    <w:p>
+      <w:r>
+        <w:rPr>
+          <w:b/>
+          <w:color w:val="5A4412"/>
+        </w:rPr>
+        <w:t>▶ PÁGINA 4 do slide</w:t>
+      </w:r>
+      <w:r>
+        <w:t xml:space="preserve"> · Atividade</w:t>
       </w:r>
     </w:p>
     <w:p>
@@ -1659,7 +1787,10 @@
           <w:b/>
           <w:color w:val="5A4412"/>
         </w:rPr>
-        <w:t>[SLIDE 1: A mente de quem compra]</w:t>
+        <w:t>▶ PÁGINA 1 do slide</w:t>
+      </w:r>
+      <w:r>
+        <w:t xml:space="preserve"> · A mente de quem compra</w:t>
       </w:r>
     </w:p>
     <w:p>
@@ -1688,7 +1819,10 @@
           <w:b/>
           <w:color w:val="5A4412"/>
         </w:rPr>
-        <w:t>[SLIDE 2: Daniel Kahneman · Rápido e Devagar · Nobel de Economia]</w:t>
+        <w:t>▶ PÁGINA 2 do slide</w:t>
+      </w:r>
+      <w:r>
+        <w:t xml:space="preserve"> · Daniel Kahneman · Rápido e Devagar · Nobel de Economia</w:t>
       </w:r>
     </w:p>
     <w:p>
@@ -1716,7 +1850,10 @@
           <w:b/>
           <w:color w:val="5A4412"/>
         </w:rPr>
-        <w:t>[SLIDE 3: Sistema 1: rápido, automático, emocional · Sistema 2: lento, analítico, cansativo]</w:t>
+        <w:t>▶ PÁGINA 3 do slide</w:t>
+      </w:r>
+      <w:r>
+        <w:t xml:space="preserve"> · Sistema 1: rápido, automático, emocional · Sistema 2: lento, analítico, cansativo</w:t>
       </w:r>
     </w:p>
     <w:p>
@@ -1740,7 +1877,10 @@
           <w:b/>
           <w:color w:val="5A4412"/>
         </w:rPr>
-        <w:t>[SLIDE 4: A emoção decide. A razão justifica.]</w:t>
+        <w:t>▶ PÁGINA 4 do slide</w:t>
+      </w:r>
+      <w:r>
+        <w:t xml:space="preserve"> · A emoção decide. A razão justifica.</w:t>
       </w:r>
     </w:p>
     <w:p>
@@ -1764,7 +1904,10 @@
           <w:b/>
           <w:color w:val="5A4412"/>
         </w:rPr>
-        <w:t>[SLIDE 5: O erro mais comum: abrir o post com a ficha técnica]</w:t>
+        <w:t>▶ PÁGINA 5 do slide</w:t>
+      </w:r>
+      <w:r>
+        <w:t xml:space="preserve"> · O erro mais comum: abrir o post com a ficha técnica</w:t>
       </w:r>
     </w:p>
     <w:p>
@@ -1788,7 +1931,10 @@
           <w:b/>
           <w:color w:val="5A4412"/>
         </w:rPr>
-        <w:t>[SLIDE 6: Clínica A: "Tecnologia de última geração" × Clínica B: "Eu evitava tirar foto de perfil há 3 anos…"]</w:t>
+        <w:t>▶ PÁGINA 6 do slide</w:t>
+      </w:r>
+      <w:r>
+        <w:t xml:space="preserve"> · Clínica A: "Tecnologia de última geração" × Clínica B: "Eu evitava tirar foto de perfil há 3 anos…"</w:t>
       </w:r>
     </w:p>
     <w:p>
@@ -1822,7 +1968,10 @@
           <w:b/>
           <w:color w:val="5A4412"/>
         </w:rPr>
-        <w:t>[SLIDE 7: Primeiro o Sistema 1 (imagem, história, identificação, curiosidade) · Depois o Sistema 2 (prova, preço, garantia)]</w:t>
+        <w:t>▶ PÁGINA 7 do slide</w:t>
+      </w:r>
+      <w:r>
+        <w:t xml:space="preserve"> · Primeiro o Sistema 1 (imagem, história, identificação, curiosidade) · Depois o Sistema 2 (prova, preço, garantia)</w:t>
       </w:r>
     </w:p>
     <w:p>
@@ -1846,7 +1995,10 @@
           <w:b/>
           <w:color w:val="5A4412"/>
         </w:rPr>
-        <w:t>[SLIDE 8: Como adaptar ao seu cenário]</w:t>
+        <w:t>▶ PÁGINA 8 do slide</w:t>
+      </w:r>
+      <w:r>
+        <w:t xml:space="preserve"> · Como adaptar ao seu cenário</w:t>
       </w:r>
     </w:p>
     <w:p>
@@ -1890,7 +2042,10 @@
           <w:b/>
           <w:color w:val="5A4412"/>
         </w:rPr>
-        <w:t>[SLIDE 9: Atividade]</w:t>
+        <w:t>▶ PÁGINA 9 do slide</w:t>
+      </w:r>
+      <w:r>
+        <w:t xml:space="preserve"> · Atividade</w:t>
       </w:r>
     </w:p>
     <w:p>
@@ -1917,7 +2072,7 @@
         <w:t>🅱️ Plano B (se não der para aparecer):</w:t>
       </w:r>
       <w:r>
-        <w:t xml:space="preserve"> grave como 🖥️ Voz + Canva. Os mesmos textos dos [SLIDE] viram as páginas do Canva, e você lê o mesmo roteiro narrando. A entrega fica igual.</w:t>
+        <w:t xml:space="preserve"> grave como 🖥️ Voz + Canva. Use os slides desta aula no Canva e leia o mesmo roteiro, passando a página em cada ▶ PÁGINA. A entrega fica igual.</w:t>
       </w:r>
     </w:p>
     <w:p>
@@ -1979,7 +2134,10 @@
           <w:b/>
           <w:color w:val="5A4412"/>
         </w:rPr>
-        <w:t>[TELA 1: Gatilhos sem manipulação · Robert Cialdini · As Armas da Persuasão]</w:t>
+        <w:t>▶ PÁGINA 1 do slide</w:t>
+      </w:r>
+      <w:r>
+        <w:t xml:space="preserve"> · Gatilhos sem manipulação · Robert Cialdini · As Armas da Persuasão</w:t>
       </w:r>
     </w:p>
     <w:p>
@@ -2017,7 +2175,10 @@
           <w:b/>
           <w:color w:val="5A4412"/>
         </w:rPr>
-        <w:t>[TELA 2: 1. Reciprocidade · print: o e-book de presente]</w:t>
+        <w:t>▶ PÁGINA 2 do slide</w:t>
+      </w:r>
+      <w:r>
+        <w:t xml:space="preserve"> · 1. Reciprocidade · print: o e-book de presente</w:t>
       </w:r>
     </w:p>
     <w:p>
@@ -2041,7 +2202,10 @@
           <w:b/>
           <w:color w:val="5A4412"/>
         </w:rPr>
-        <w:t>[TELA 3: 2. Compromisso e coerência · print: comentário com a palavra-chave]</w:t>
+        <w:t>▶ PÁGINA 3 do slide</w:t>
+      </w:r>
+      <w:r>
+        <w:t xml:space="preserve"> · 2. Compromisso e coerência · print: comentário com a palavra-chave</w:t>
       </w:r>
     </w:p>
     <w:p>
@@ -2060,7 +2224,10 @@
           <w:b/>
           <w:color w:val="5A4412"/>
         </w:rPr>
-        <w:t>[TELA 4: 3. Prova social · print: capa do Case CRM]</w:t>
+        <w:t>▶ PÁGINA 4 do slide</w:t>
+      </w:r>
+      <w:r>
+        <w:t xml:space="preserve"> · 3. Prova social · print: capa do Case CRM</w:t>
       </w:r>
     </w:p>
     <w:p>
@@ -2079,7 +2246,10 @@
           <w:b/>
           <w:color w:val="5A4412"/>
         </w:rPr>
-        <w:t>[TELA 5: 4. Afeição · print: foto de bastidor]</w:t>
+        <w:t>▶ PÁGINA 5 do slide</w:t>
+      </w:r>
+      <w:r>
+        <w:t xml:space="preserve"> · 4. Afeição · print: foto de bastidor</w:t>
       </w:r>
     </w:p>
     <w:p>
@@ -2098,7 +2268,10 @@
           <w:b/>
           <w:color w:val="5A4412"/>
         </w:rPr>
-        <w:t>[TELA 6: 5. Autoridade · print: análise da Toyota]</w:t>
+        <w:t>▶ PÁGINA 6 do slide</w:t>
+      </w:r>
+      <w:r>
+        <w:t xml:space="preserve"> · 5. Autoridade · print: análise da Toyota</w:t>
       </w:r>
     </w:p>
     <w:p>
@@ -2122,7 +2295,10 @@
           <w:b/>
           <w:color w:val="5A4412"/>
         </w:rPr>
-        <w:t>[TELA 7: 6. Escassez · print: "a condição especial pode mudar a qualquer momento"]</w:t>
+        <w:t>▶ PÁGINA 7 do slide</w:t>
+      </w:r>
+      <w:r>
+        <w:t xml:space="preserve"> · 6. Escassez · print: "a condição especial pode mudar a qualquer momento"</w:t>
       </w:r>
     </w:p>
     <w:p>
@@ -2146,7 +2322,10 @@
           <w:b/>
           <w:color w:val="5A4412"/>
         </w:rPr>
-        <w:t>[TELA 8: 7. Unidade · "nós, donos de pequenos negócios"]</w:t>
+        <w:t>▶ PÁGINA 8 do slide</w:t>
+      </w:r>
+      <w:r>
+        <w:t xml:space="preserve"> · 7. Unidade · "nós, donos de pequenos negócios"</w:t>
       </w:r>
     </w:p>
     <w:p>
@@ -2165,7 +2344,10 @@
           <w:b/>
           <w:color w:val="5A4412"/>
         </w:rPr>
-        <w:t>[TELA 9: Gatilho não é truque]</w:t>
+        <w:t>▶ PÁGINA 9 do slide</w:t>
+      </w:r>
+      <w:r>
+        <w:t xml:space="preserve"> · Gatilho não é truque</w:t>
       </w:r>
     </w:p>
     <w:p>
@@ -2184,7 +2366,10 @@
           <w:b/>
           <w:color w:val="5A4412"/>
         </w:rPr>
-        <w:t>[TELA 10: Atividade]</w:t>
+        <w:t>▶ PÁGINA 10 do slide</w:t>
+      </w:r>
+      <w:r>
+        <w:t xml:space="preserve"> · Atividade</w:t>
       </w:r>
     </w:p>
     <w:p>
@@ -2245,6 +2430,18 @@
     </w:p>
     <w:p>
       <w:r>
+        <w:rPr>
+          <w:b/>
+          <w:color w:val="5A4412"/>
+        </w:rPr>
+        <w:t>▶ PÁGINA 1 do slide</w:t>
+      </w:r>
+      <w:r>
+        <w:t xml:space="preserve"> · Capa</w:t>
+      </w:r>
+    </w:p>
+    <w:p>
+      <w:r>
         <w:t>Existem dois jeitos de vender no Instagram.</w:t>
       </w:r>
     </w:p>
@@ -2255,6 +2452,18 @@
     </w:p>
     <w:p>
       <w:r>
+        <w:rPr>
+          <w:b/>
+          <w:color w:val="5A4412"/>
+        </w:rPr>
+        <w:t>▶ PÁGINA 2 do slide</w:t>
+      </w:r>
+      <w:r>
+        <w:t xml:space="preserve"> · Dois jeitos de vender</w:t>
+      </w:r>
+    </w:p>
+    <w:p>
+      <w:r>
         <w:t>E ela funciona. Mas só com uma parte bem pequena das pessoas: as que já estavam prontas para comprar. As que já conhecem você, já confiam, já precisam do produto e só estavam esperando o empurrãozinho.</w:t>
       </w:r>
     </w:p>
@@ -2275,6 +2484,18 @@
     </w:p>
     <w:p>
       <w:r>
+        <w:rPr>
+          <w:b/>
+          <w:color w:val="5A4412"/>
+        </w:rPr>
+        <w:t>▶ PÁGINA 3 do slide</w:t>
+      </w:r>
+      <w:r>
+        <w:t xml:space="preserve"> · Exemplo: a doceria</w:t>
+      </w:r>
+    </w:p>
+    <w:p>
+      <w:r>
         <w:t>Deixa eu te dar um exemplo. Uma doceria pode postar: "Bolo de ninho com morango, 90 reais, encomende". Ou pode mostrar a cena: a criança de olho arregalado na hora do parabéns, a mãe emocionada, o bolo exatamente igual ao que ela imaginou.</w:t>
       </w:r>
     </w:p>
@@ -2295,12 +2516,36 @@
     </w:p>
     <w:p>
       <w:r>
+        <w:rPr>
+          <w:b/>
+          <w:color w:val="5A4412"/>
+        </w:rPr>
+        <w:t>▶ PÁGINA 4 do slide</w:t>
+      </w:r>
+      <w:r>
+        <w:t xml:space="preserve"> · As 4 alavancas do desejo</w:t>
+      </w:r>
+    </w:p>
+    <w:p>
+      <w:r>
         <w:t>A primeira vem do Alex Hormozi (Á-lex rôr-MÔU-zi), um empresário americano que escreveu um livro sobre ofertas. Ele diz que as pessoas desejam mais uma coisa quando percebem quatro pontos: o resultado é grande, a chance de dar certo é alta, vai levar pouco tempo e vai exigir pouco esforço.</w:t>
       </w:r>
     </w:p>
     <w:p>
       <w:r>
         <w:t>E o mais interessante é que você pode mostrar cada um desses pontos no conteúdo, sem dizer "compre". Mostra o resultado de um cliente. Mostra o passo a passo, para a pessoa ver que é possível. Mostra quanto tempo leva. Mostra como é fácil para o cliente, porque você faz a parte difícil.</w:t>
+      </w:r>
+    </w:p>
+    <w:p>
+      <w:r>
+        <w:rPr>
+          <w:b/>
+          <w:color w:val="5A4412"/>
+        </w:rPr>
+        <w:t>▶ PÁGINA 5 do slide</w:t>
+      </w:r>
+      <w:r>
+        <w:t xml:space="preserve"> · A impressão de aumento</w:t>
       </w:r>
     </w:p>
     <w:p>
@@ -2324,6 +2569,18 @@
     </w:p>
     <w:p>
       <w:r>
+        <w:rPr>
+          <w:b/>
+          <w:color w:val="5A4412"/>
+        </w:rPr>
+        <w:t>▶ PÁGINA 6 do slide</w:t>
+      </w:r>
+      <w:r>
+        <w:t xml:space="preserve"> · O Jeito Disney</w:t>
+      </w:r>
+    </w:p>
+    <w:p>
+      <w:r>
         <w:t xml:space="preserve">E a terceira ideia vem da Disney. Existe um livro chamado </w:t>
       </w:r>
       <w:r>
@@ -2343,12 +2600,36 @@
     </w:p>
     <w:p>
       <w:r>
+        <w:rPr>
+          <w:b/>
+          <w:color w:val="5A4412"/>
+        </w:rPr>
+        <w:t>▶ PÁGINA 7 do slide</w:t>
+      </w:r>
+      <w:r>
+        <w:t xml:space="preserve"> · Primeiro a pessoa quer</w:t>
+      </w:r>
+    </w:p>
+    <w:p>
+      <w:r>
         <w:t>Então, resumindo: oferta direta funciona com quem já está pronto. Oferta indireta faz o resto das pessoas ficarem prontas.</w:t>
       </w:r>
     </w:p>
     <w:p>
       <w:r>
         <w:t>E isso não quer dizer que você nunca mais vai dizer o preço ou chamar para comprar. Vai, sim. Mas depois de gerar desejo. Primeiro a pessoa quer. Depois você mostra como ter.</w:t>
+      </w:r>
+    </w:p>
+    <w:p>
+      <w:r>
+        <w:rPr>
+          <w:b/>
+          <w:color w:val="5A4412"/>
+        </w:rPr>
+        <w:t>▶ PÁGINA 8 do slide</w:t>
+      </w:r>
+      <w:r>
+        <w:t xml:space="preserve"> · Atividade</w:t>
       </w:r>
     </w:p>
     <w:p>
@@ -2375,71 +2656,7 @@
         <w:t>🅱️ Plano B (se não der para aparecer):</w:t>
       </w:r>
       <w:r>
-        <w:t xml:space="preserve"> grave como 🖥️ Voz + Canva, lendo o mesmo texto. Páginas do Canva, na ordem da fala:</w:t>
-      </w:r>
-    </w:p>
-    <w:p>
-      <w:pPr>
-        <w:pStyle w:val="ListNumber"/>
-      </w:pPr>
-      <w:r>
-        <w:t>Oferta direta: "Compre agora, R$ 99" → funciona com quem já está pronto</w:t>
-      </w:r>
-    </w:p>
-    <w:p>
-      <w:pPr>
-        <w:pStyle w:val="ListNumber"/>
-      </w:pPr>
-      <w:r>
-        <w:t>Oferta indireta: o produto dentro de uma situação, história ou resultado</w:t>
-      </w:r>
-    </w:p>
-    <w:p>
-      <w:pPr>
-        <w:pStyle w:val="ListNumber"/>
-      </w:pPr>
-      <w:r>
-        <w:t>Exemplo: a doceria (preço × a cena do parabéns)</w:t>
-      </w:r>
-    </w:p>
-    <w:p>
-      <w:pPr>
-        <w:pStyle w:val="ListNumber"/>
-      </w:pPr>
-      <w:r>
-        <w:t>Alex Hormozi (rôr-MÔU-zi): resultado grande · chance alta · pouco tempo · pouco esforço</w:t>
-      </w:r>
-    </w:p>
-    <w:p>
-      <w:pPr>
-        <w:pStyle w:val="ListNumber"/>
-      </w:pPr>
-      <w:r>
-        <w:t>Wallace Wattles (UÓ-tous): a impressão de aumento</w:t>
-      </w:r>
-    </w:p>
-    <w:p>
-      <w:pPr>
-        <w:pStyle w:val="ListNumber"/>
-      </w:pPr>
-      <w:r>
-        <w:t>O Jeito Disney: cada ponto de contato é palco</w:t>
-      </w:r>
-    </w:p>
-    <w:p>
-      <w:pPr>
-        <w:pStyle w:val="ListNumber"/>
-      </w:pPr>
-      <w:r>
-        <w:t>Primeiro a pessoa quer. Depois você mostra como ter.</w:t>
-      </w:r>
-    </w:p>
-    <w:p>
-      <w:pPr>
-        <w:pStyle w:val="ListNumber"/>
-      </w:pPr>
-      <w:r>
-        <w:t>Atividade: transforme uma oferta direta em indireta</w:t>
+        <w:t xml:space="preserve"> grave como 🖥️ Voz + Canva com os slides desta aula, lendo o mesmo texto e passando a página em cada ▶ PÁGINA.</w:t>
       </w:r>
     </w:p>
     <w:p>
@@ -2501,7 +2718,10 @@
           <w:b/>
           <w:color w:val="5A4412"/>
         </w:rPr>
-        <w:t>[TELA 1: Burger King × Dragon Ball · a memória afetiva que vende]</w:t>
+        <w:t>▶ PÁGINA 1 do slide</w:t>
+      </w:r>
+      <w:r>
+        <w:t xml:space="preserve"> · Burger King × Dragon Ball · a memória afetiva que vende</w:t>
       </w:r>
     </w:p>
     <w:p>
@@ -2515,7 +2735,10 @@
           <w:b/>
           <w:color w:val="5A4412"/>
         </w:rPr>
-        <w:t>[TELA 2: Setembro de 2026 · coleção Dragon Ball Super · parceria com a Toei Animation · 6 bonecos colecionáveis · Fonte: JBox, Einerd, GKPB]</w:t>
+        <w:t>▶ PÁGINA 2 do slide</w:t>
+      </w:r>
+      <w:r>
+        <w:t xml:space="preserve"> · Setembro de 2026 · coleção Dragon Ball Super · parceria com a Toei Animation · 6 bonecos colecionáveis · Fonte: JBox, Einerd, GKPB</w:t>
       </w:r>
     </w:p>
     <w:p>
@@ -2534,7 +2757,10 @@
           <w:b/>
           <w:color w:val="5A4412"/>
         </w:rPr>
-        <w:t>[TELA 3: Para quem é, de verdade?]</w:t>
+        <w:t>▶ PÁGINA 3 do slide</w:t>
+      </w:r>
+      <w:r>
+        <w:t xml:space="preserve"> · Para quem é, de verdade?</w:t>
       </w:r>
     </w:p>
     <w:p>
@@ -2558,7 +2784,10 @@
           <w:b/>
           <w:color w:val="5A4412"/>
         </w:rPr>
-        <w:t>[TELA 4: Não é hambúrguer. É a volta à infância.]</w:t>
+        <w:t>▶ PÁGINA 4 do slide</w:t>
+      </w:r>
+      <w:r>
+        <w:t xml:space="preserve"> · Não é hambúrguer. É a volta à infância.</w:t>
       </w:r>
     </w:p>
     <w:p>
@@ -2582,7 +2811,10 @@
           <w:b/>
           <w:color w:val="5A4412"/>
         </w:rPr>
-        <w:t>[TELA 5: 6 bonecos = 6 visitas]</w:t>
+        <w:t>▶ PÁGINA 5 do slide</w:t>
+      </w:r>
+      <w:r>
+        <w:t xml:space="preserve"> · 6 bonecos = 6 visitas</w:t>
       </w:r>
     </w:p>
     <w:p>
@@ -2601,7 +2833,10 @@
           <w:b/>
           <w:color w:val="5A4412"/>
         </w:rPr>
-        <w:t>[TELA 6: O público faz o marketing]</w:t>
+        <w:t>▶ PÁGINA 6 do slide</w:t>
+      </w:r>
+      <w:r>
+        <w:t xml:space="preserve"> · O público faz o marketing</w:t>
       </w:r>
     </w:p>
     <w:p>
@@ -2620,7 +2855,10 @@
           <w:b/>
           <w:color w:val="5A4412"/>
         </w:rPr>
-        <w:t>[TELA 7: Como adaptar ao seu negócio]</w:t>
+        <w:t>▶ PÁGINA 7 do slide</w:t>
+      </w:r>
+      <w:r>
+        <w:t xml:space="preserve"> · Como adaptar ao seu negócio</w:t>
       </w:r>
     </w:p>
     <w:p>
@@ -2649,7 +2887,10 @@
           <w:b/>
           <w:color w:val="5A4412"/>
         </w:rPr>
-        <w:t>[TELA 8: Atividade]</w:t>
+        <w:t>▶ PÁGINA 8 do slide</w:t>
+      </w:r>
+      <w:r>
+        <w:t xml:space="preserve"> · Atividade</w:t>
       </w:r>
     </w:p>
     <w:p>
@@ -2725,7 +2966,10 @@
           <w:b/>
           <w:color w:val="5A4412"/>
         </w:rPr>
-        <w:t>[SLIDE 1: Storytelling · por que as histórias prendem]</w:t>
+        <w:t>▶ PÁGINA 1 do slide</w:t>
+      </w:r>
+      <w:r>
+        <w:t xml:space="preserve"> · Storytelling · por que as histórias prendem</w:t>
       </w:r>
     </w:p>
     <w:p>
@@ -2744,7 +2988,10 @@
           <w:b/>
           <w:color w:val="5A4412"/>
         </w:rPr>
-        <w:t>[SLIDE 2: Imagem da pintura de Leang Karampuang · Sulawesi, Indonésia · pelo menos 51.200 anos · Fonte: revista Nature, 2024]</w:t>
+        <w:t>▶ PÁGINA 2 do slide</w:t>
+      </w:r>
+      <w:r>
+        <w:t xml:space="preserve"> · Imagem da pintura de Leang Karampuang · Sulawesi, Indonésia · pelo menos 51.200 anos · Fonte: revista Nature, 2024</w:t>
       </w:r>
     </w:p>
     <w:p>
@@ -2777,7 +3024,10 @@
           <w:b/>
           <w:color w:val="5A4412"/>
         </w:rPr>
-        <w:t>[SLIDE 3: Yuval Noah Harari · Sapiens]</w:t>
+        <w:t>▶ PÁGINA 3 do slide</w:t>
+      </w:r>
+      <w:r>
+        <w:t xml:space="preserve"> · Yuval Noah Harari · Sapiens</w:t>
       </w:r>
     </w:p>
     <w:p>
@@ -2810,7 +3060,10 @@
           <w:b/>
           <w:color w:val="5A4412"/>
         </w:rPr>
-        <w:t>[SLIDE 4: Dado × história]</w:t>
+        <w:t>▶ PÁGINA 4 do slide</w:t>
+      </w:r>
+      <w:r>
+        <w:t xml:space="preserve"> · Dado × história</w:t>
       </w:r>
     </w:p>
     <w:p>
@@ -2824,7 +3077,10 @@
           <w:b/>
           <w:color w:val="5A4412"/>
         </w:rPr>
-        <w:t>[SLIDE 5: "Nosso bolo usa ingredientes selecionados." × "A receita é da minha avó, que fazia esse bolo todo domingo…"]</w:t>
+        <w:t>▶ PÁGINA 5 do slide</w:t>
+      </w:r>
+      <w:r>
+        <w:t xml:space="preserve"> · "Nosso bolo usa ingredientes selecionados." × "A receita é da minha avó, que fazia esse bolo todo domingo…"</w:t>
       </w:r>
     </w:p>
     <w:p>
@@ -2858,7 +3114,10 @@
           <w:b/>
           <w:color w:val="5A4412"/>
         </w:rPr>
-        <w:t>[SLIDE 6: Toda história tem 3 elementos · personagem · conflito · transformação]</w:t>
+        <w:t>▶ PÁGINA 6 do slide</w:t>
+      </w:r>
+      <w:r>
+        <w:t xml:space="preserve"> · Toda história tem 3 elementos · personagem · conflito · transformação</w:t>
       </w:r>
     </w:p>
     <w:p>
@@ -2892,7 +3151,10 @@
           <w:b/>
           <w:color w:val="5A4412"/>
         </w:rPr>
-        <w:t>[SLIDE 7: Como adaptar ao seu cenário]</w:t>
+        <w:t>▶ PÁGINA 7 do slide</w:t>
+      </w:r>
+      <w:r>
+        <w:t xml:space="preserve"> · Como adaptar ao seu cenário</w:t>
       </w:r>
     </w:p>
     <w:p>
@@ -2941,7 +3203,10 @@
           <w:b/>
           <w:color w:val="5A4412"/>
         </w:rPr>
-        <w:t>[SLIDE 8: Atividade]</w:t>
+        <w:t>▶ PÁGINA 8 do slide</w:t>
+      </w:r>
+      <w:r>
+        <w:t xml:space="preserve"> · Atividade</w:t>
       </w:r>
     </w:p>
     <w:p>
@@ -2968,7 +3233,7 @@
         <w:t>🅱️ Plano B (se não der para aparecer):</w:t>
       </w:r>
       <w:r>
-        <w:t xml:space="preserve"> grave como 🖥️ Voz + Canva. Os mesmos textos dos [SLIDE] viram as páginas do Canva, e você lê o mesmo roteiro narrando. A entrega fica igual.</w:t>
+        <w:t xml:space="preserve"> grave como 🖥️ Voz + Canva. Use os slides desta aula no Canva e leia o mesmo roteiro, passando a página em cada ▶ PÁGINA. A entrega fica igual.</w:t>
       </w:r>
     </w:p>
     <w:p>
@@ -3030,7 +3295,10 @@
           <w:b/>
           <w:color w:val="5A4412"/>
         </w:rPr>
-        <w:t>[TELA 1: Quem é o herói da sua história?]</w:t>
+        <w:t>▶ PÁGINA 1 do slide</w:t>
+      </w:r>
+      <w:r>
+        <w:t xml:space="preserve"> · Quem é o herói da sua história?</w:t>
       </w:r>
     </w:p>
     <w:p>
@@ -3044,7 +3312,10 @@
           <w:b/>
           <w:color w:val="5A4412"/>
         </w:rPr>
-        <w:t>[TELA 2: A jornada do herói · Joseph Campbell · uma pessoa comum → um problema → encontra um guia → enfrenta o desafio → se transforma]</w:t>
+        <w:t>▶ PÁGINA 2 do slide</w:t>
+      </w:r>
+      <w:r>
+        <w:t xml:space="preserve"> · A jornada do herói · Joseph Campbell · uma pessoa comum → um problema → encontra um guia → enfrenta o desafio → se transforma</w:t>
       </w:r>
     </w:p>
     <w:p>
@@ -3068,7 +3339,10 @@
           <w:b/>
           <w:color w:val="5A4412"/>
         </w:rPr>
-        <w:t>[TELA 3: O erro mais comum: a marca como herói · "Somos os melhores" · "Somos líderes" · "Nossa qualidade é incomparável"]</w:t>
+        <w:t>▶ PÁGINA 3 do slide</w:t>
+      </w:r>
+      <w:r>
+        <w:t xml:space="preserve"> · O erro mais comum: a marca como herói · "Somos os melhores" · "Somos líderes" · "Nossa qualidade é incomparável"</w:t>
       </w:r>
     </w:p>
     <w:p>
@@ -3092,7 +3366,10 @@
           <w:b/>
           <w:color w:val="5A4412"/>
         </w:rPr>
-        <w:t>[TELA 4: StoryBrand · Donald Miller · o cliente é o herói, a marca é o guia]</w:t>
+        <w:t>▶ PÁGINA 4 do slide</w:t>
+      </w:r>
+      <w:r>
+        <w:t xml:space="preserve"> · StoryBrand · Donald Miller · o cliente é o herói, a marca é o guia</w:t>
       </w:r>
     </w:p>
     <w:p>
@@ -3130,7 +3407,10 @@
           <w:b/>
           <w:color w:val="5A4412"/>
         </w:rPr>
-        <w:t>[TELA 5: A história sem final · o efeito Zeigarnik]</w:t>
+        <w:t>▶ PÁGINA 5 do slide</w:t>
+      </w:r>
+      <w:r>
+        <w:t xml:space="preserve"> · A história sem final · o efeito Zeigarnik</w:t>
       </w:r>
     </w:p>
     <w:p>
@@ -3154,7 +3434,10 @@
           <w:b/>
           <w:color w:val="5A4412"/>
         </w:rPr>
-        <w:t>[TELA 6: Por isso a novela acaba no ápice]</w:t>
+        <w:t>▶ PÁGINA 6 do slide</w:t>
+      </w:r>
+      <w:r>
+        <w:t xml:space="preserve"> · Por isso a novela acaba no ápice</w:t>
       </w:r>
     </w:p>
     <w:p>
@@ -3173,7 +3456,10 @@
           <w:b/>
           <w:color w:val="5A4412"/>
         </w:rPr>
-        <w:t>[TELA 7: Na prática · abra um "loop" no começo e feche no final]</w:t>
+        <w:t>▶ PÁGINA 7 do slide</w:t>
+      </w:r>
+      <w:r>
+        <w:t xml:space="preserve"> · Na prática · abra um "loop" no começo e feche no final</w:t>
       </w:r>
     </w:p>
     <w:p>
@@ -3202,7 +3488,10 @@
           <w:b/>
           <w:color w:val="5A4412"/>
         </w:rPr>
-        <w:t>[TELA 8: Análise · carrossel Case CRM · capa]</w:t>
+        <w:t>▶ PÁGINA 8 do slide</w:t>
+      </w:r>
+      <w:r>
+        <w:t xml:space="preserve"> · Análise · carrossel Case CRM · capa</w:t>
       </w:r>
     </w:p>
     <w:p>
@@ -3221,7 +3510,10 @@
           <w:b/>
           <w:color w:val="5A4412"/>
         </w:rPr>
-        <w:t>[TELA 9: cards do meio]</w:t>
+        <w:t>▶ PÁGINA 9 do slide</w:t>
+      </w:r>
+      <w:r>
+        <w:t xml:space="preserve"> · cards do meio</w:t>
       </w:r>
     </w:p>
     <w:p>
@@ -3235,7 +3527,10 @@
           <w:b/>
           <w:color w:val="5A4412"/>
         </w:rPr>
-        <w:t>[TELA 10: último card]</w:t>
+        <w:t>▶ PÁGINA 10 do slide</w:t>
+      </w:r>
+      <w:r>
+        <w:t xml:space="preserve"> · último card</w:t>
       </w:r>
     </w:p>
     <w:p>
@@ -3254,7 +3549,10 @@
           <w:b/>
           <w:color w:val="5A4412"/>
         </w:rPr>
-        <w:t>[TELA 11: Atividade]</w:t>
+        <w:t>▶ PÁGINA 11 do slide</w:t>
+      </w:r>
+      <w:r>
+        <w:t xml:space="preserve"> · Atividade</w:t>
       </w:r>
     </w:p>
     <w:p>
@@ -3320,6 +3618,18 @@
     </w:p>
     <w:p>
       <w:r>
+        <w:rPr>
+          <w:b/>
+          <w:color w:val="5A4412"/>
+        </w:rPr>
+        <w:t>▶ PÁGINA 1 do slide</w:t>
+      </w:r>
+      <w:r>
+        <w:t xml:space="preserve"> · Capa</w:t>
+      </w:r>
+    </w:p>
+    <w:p>
+      <w:r>
         <w:t>"Amanda, mas o meu negócio não tem história."</w:t>
       </w:r>
     </w:p>
@@ -3330,11 +3640,35 @@
     </w:p>
     <w:p>
       <w:r>
+        <w:rPr>
+          <w:b/>
+          <w:color w:val="5A4412"/>
+        </w:rPr>
+        <w:t>▶ PÁGINA 2 do slide</w:t>
+      </w:r>
+      <w:r>
+        <w:t xml:space="preserve"> · "O meu negócio não tem história." Tem, sim.</w:t>
+      </w:r>
+    </w:p>
+    <w:p>
+      <w:r>
         <w:t>O que para você é rotina, para o seu cliente é novidade. O que para você é óbvio, para ele é curiosidade.</w:t>
       </w:r>
     </w:p>
     <w:p>
       <w:r>
+        <w:rPr>
+          <w:b/>
+          <w:color w:val="5A4412"/>
+        </w:rPr>
+        <w:t>▶ PÁGINA 3 do slide</w:t>
+      </w:r>
+      <w:r>
+        <w:t xml:space="preserve"> · As 8 histórias</w:t>
+      </w:r>
+    </w:p>
+    <w:p>
+      <w:r>
         <w:t>Então eu vou te passar agora 8 tipos de história que todo negócio tem. Todo. Pode ser uma borracharia, uma nutricionista, uma loja de roupas ou uma consultoria.</w:t>
       </w:r>
     </w:p>
@@ -3380,6 +3714,18 @@
     </w:p>
     <w:p>
       <w:r>
+        <w:rPr>
+          <w:b/>
+          <w:color w:val="5A4412"/>
+        </w:rPr>
+        <w:t>▶ PÁGINA 4 do slide</w:t>
+      </w:r>
+      <w:r>
+        <w:t xml:space="preserve"> · Exemplos</w:t>
+      </w:r>
+    </w:p>
+    <w:p>
+      <w:r>
         <w:t>Deixa eu te dar três exemplos para você ver como isso funciona na prática.</w:t>
       </w:r>
     </w:p>
@@ -3401,6 +3747,18 @@
     <w:p>
       <w:r>
         <w:t>Percebe? A história já existe. Você só precisa começar a enxergar.</w:t>
+      </w:r>
+    </w:p>
+    <w:p>
+      <w:r>
+        <w:rPr>
+          <w:b/>
+          <w:color w:val="5A4412"/>
+        </w:rPr>
+        <w:t>▶ PÁGINA 5 do slide</w:t>
+      </w:r>
+      <w:r>
+        <w:t xml:space="preserve"> · Atividade</w:t>
       </w:r>
     </w:p>
     <w:p>
@@ -3432,95 +3790,7 @@
         <w:t>🅱️ Plano B (se não der para aparecer):</w:t>
       </w:r>
       <w:r>
-        <w:t xml:space="preserve"> grave como 🖥️ Voz + Canva, lendo o mesmo texto. Páginas do Canva, na ordem da fala:</w:t>
-      </w:r>
-    </w:p>
-    <w:p>
-      <w:pPr>
-        <w:pStyle w:val="ListNumber"/>
-      </w:pPr>
-      <w:r>
-        <w:t>"O meu negócio não tem história." Tem, sim.</w:t>
-      </w:r>
-    </w:p>
-    <w:p>
-      <w:pPr>
-        <w:pStyle w:val="ListNumber"/>
-      </w:pPr>
-      <w:r>
-        <w:t>1. Origem</w:t>
-      </w:r>
-    </w:p>
-    <w:p>
-      <w:pPr>
-        <w:pStyle w:val="ListNumber"/>
-      </w:pPr>
-      <w:r>
-        <w:t>2. O porquê</w:t>
-      </w:r>
-    </w:p>
-    <w:p>
-      <w:pPr>
-        <w:pStyle w:val="ListNumber"/>
-      </w:pPr>
-      <w:r>
-        <w:t>3. Bastidor</w:t>
-      </w:r>
-    </w:p>
-    <w:p>
-      <w:pPr>
-        <w:pStyle w:val="ListNumber"/>
-      </w:pPr>
-      <w:r>
-        <w:t>4. O erro</w:t>
-      </w:r>
-    </w:p>
-    <w:p>
-      <w:pPr>
-        <w:pStyle w:val="ListNumber"/>
-      </w:pPr>
-      <w:r>
-        <w:t>5. O cliente</w:t>
-      </w:r>
-    </w:p>
-    <w:p>
-      <w:pPr>
-        <w:pStyle w:val="ListNumber"/>
-      </w:pPr>
-      <w:r>
-        <w:t>6. A equipe</w:t>
-      </w:r>
-    </w:p>
-    <w:p>
-      <w:pPr>
-        <w:pStyle w:val="ListNumber"/>
-      </w:pPr>
-      <w:r>
-        <w:t>7. O dia a dia</w:t>
-      </w:r>
-    </w:p>
-    <w:p>
-      <w:pPr>
-        <w:pStyle w:val="ListNumber"/>
-      </w:pPr>
-      <w:r>
-        <w:t>8. O inimigo</w:t>
-      </w:r>
-    </w:p>
-    <w:p>
-      <w:pPr>
-        <w:pStyle w:val="ListNumber"/>
-      </w:pPr>
-      <w:r>
-        <w:t>Exemplos: borracharia · nutricionista · loja de roupas</w:t>
-      </w:r>
-    </w:p>
-    <w:p>
-      <w:pPr>
-        <w:pStyle w:val="ListNumber"/>
-      </w:pPr>
-      <w:r>
-        <w:t>Atividade: o seu Banco de Histórias</w:t>
+        <w:t xml:space="preserve"> grave como 🖥️ Voz + Canva com os slides desta aula, lendo o mesmo texto e passando a página em cada ▶ PÁGINA.</w:t>
       </w:r>
     </w:p>
     <w:p>
@@ -3582,7 +3852,10 @@
           <w:b/>
           <w:color w:val="5A4412"/>
         </w:rPr>
-        <w:t>[TELA 1: Tudo vira conteúdo · documente a sua vida e o seu negócio]</w:t>
+        <w:t>▶ PÁGINA 1 do slide</w:t>
+      </w:r>
+      <w:r>
+        <w:t xml:space="preserve"> · Tudo vira conteúdo · documente a sua vida e o seu negócio</w:t>
       </w:r>
     </w:p>
     <w:p>
@@ -3606,7 +3879,10 @@
           <w:b/>
           <w:color w:val="5A4412"/>
         </w:rPr>
-        <w:t>[TELA 2: Austin Kleon · Mostre seu Trabalho!]</w:t>
+        <w:t>▶ PÁGINA 2 do slide</w:t>
+      </w:r>
+      <w:r>
+        <w:t xml:space="preserve"> · Austin Kleon · Mostre seu Trabalho!</w:t>
       </w:r>
     </w:p>
     <w:p>
@@ -3634,7 +3910,10 @@
           <w:b/>
           <w:color w:val="5A4412"/>
         </w:rPr>
-        <w:t>[TELA 3: O método de capturar sem parar a rotina]</w:t>
+        <w:t>▶ PÁGINA 3 do slide</w:t>
+      </w:r>
+      <w:r>
+        <w:t xml:space="preserve"> · O método de capturar sem parar a rotina</w:t>
       </w:r>
     </w:p>
     <w:p>
@@ -3648,7 +3927,10 @@
           <w:b/>
           <w:color w:val="5A4412"/>
         </w:rPr>
-        <w:t>[TELA 4: 1. Um álbum "Conteúdo" no celular]</w:t>
+        <w:t>▶ PÁGINA 4 do slide</w:t>
+      </w:r>
+      <w:r>
+        <w:t xml:space="preserve"> · 1. Um álbum "Conteúdo" no celular</w:t>
       </w:r>
     </w:p>
     <w:p>
@@ -3662,7 +3944,10 @@
           <w:b/>
           <w:color w:val="5A4412"/>
         </w:rPr>
-        <w:t>[TELA 5: 2. Uma nota "Banco de ideias"]</w:t>
+        <w:t>▶ PÁGINA 5 do slide</w:t>
+      </w:r>
+      <w:r>
+        <w:t xml:space="preserve"> · 2. Uma nota "Banco de ideias"</w:t>
       </w:r>
     </w:p>
     <w:p>
@@ -3676,7 +3961,10 @@
           <w:b/>
           <w:color w:val="5A4412"/>
         </w:rPr>
-        <w:t>[TELA 6: 3. As 3 tomadas: plano aberto · detalhe · rosto]</w:t>
+        <w:t>▶ PÁGINA 6 do slide</w:t>
+      </w:r>
+      <w:r>
+        <w:t xml:space="preserve"> · 3. As 3 tomadas: plano aberto · detalhe · rosto</w:t>
       </w:r>
     </w:p>
     <w:p>
@@ -3695,7 +3983,10 @@
           <w:b/>
           <w:color w:val="5A4412"/>
         </w:rPr>
-        <w:t>[TELA 7: Um momento comum → 3 conteúdos · story · reels · carrossel]</w:t>
+        <w:t>▶ PÁGINA 7 do slide</w:t>
+      </w:r>
+      <w:r>
+        <w:t xml:space="preserve"> · Um momento comum → 3 conteúdos · story · reels · carrossel</w:t>
       </w:r>
     </w:p>
     <w:p>
@@ -3719,7 +4010,10 @@
           <w:b/>
           <w:color w:val="5A4412"/>
         </w:rPr>
-        <w:t>[TELA 8: As 4 perguntas que transformam um momento comum em conteúdo]</w:t>
+        <w:t>▶ PÁGINA 8 do slide</w:t>
+      </w:r>
+      <w:r>
+        <w:t xml:space="preserve"> · As 4 perguntas que transformam um momento comum em conteúdo</w:t>
       </w:r>
     </w:p>
     <w:p>
@@ -3743,7 +4037,10 @@
           <w:b/>
           <w:color w:val="5A4412"/>
         </w:rPr>
-        <w:t>[TELA 9: Como adaptar ao seu cenário]</w:t>
+        <w:t>▶ PÁGINA 9 do slide</w:t>
+      </w:r>
+      <w:r>
+        <w:t xml:space="preserve"> · Como adaptar ao seu cenário</w:t>
       </w:r>
     </w:p>
     <w:p>
@@ -3772,7 +4069,10 @@
           <w:b/>
           <w:color w:val="5A4412"/>
         </w:rPr>
-        <w:t>[TELA 10: Atividade · documentar 7 dias]</w:t>
+        <w:t>▶ PÁGINA 10 do slide</w:t>
+      </w:r>
+      <w:r>
+        <w:t xml:space="preserve"> · Atividade · documentar 7 dias</w:t>
       </w:r>
     </w:p>
     <w:p>

</xml_diff>

<commit_message>
Recria Ads: aula 1.4 com compra dos 6 bonecos de uma vez e memória afetiva além da infância
Co-Authored-By: Claude Opus 5.5 <noreply@anthropic.com>
Claude-Session: https://claude.ai/code/session_01RDM8d5cVD9w4uwiMSyLkgt
</commit_message>
<xml_diff>
--- a/agencia-recria/cursos/recria-ads/para-ler-e-gravar/Roteiros - Modulos 0 a 2.docx
+++ b/agencia-recria/cursos/recria-ads/para-ler-e-gravar/Roteiros - Modulos 0 a 2.docx
@@ -714,7 +714,7 @@
           <w:p>
             <w:r/>
             <w:r>
-              <w:t>5 min</w:t>
+              <w:t>9 min</w:t>
             </w:r>
           </w:p>
         </w:tc>
@@ -2697,7 +2697,7 @@
         <w:t>Duração:</w:t>
       </w:r>
       <w:r>
-        <w:t xml:space="preserve"> cerca de 5 min (máximo 10)</w:t>
+        <w:t xml:space="preserve"> cerca de 9 min (máximo 10)</w:t>
       </w:r>
     </w:p>
     <w:p>
@@ -2748,7 +2748,7 @@
     </w:p>
     <w:p>
       <w:r>
-        <w:t>Foram seis bonecos colecionáveis: Goku, Vegeta, as versões Super Saiyajin Deus dos dois, o Piccolo e o Bills. Eles vinham no combo King Jr., o combo infantil, e num combo temático. E, pela lei brasileira, também podiam ser comprados separadamente.</w:t>
+        <w:t>Foram seis bonecos colecionáveis: o Goku e o Vegeta, cada um em duas versões, o Piccolo e o Bills. Eles vinham no combo King Jr., o combo infantil, e num combo temático. E, pela lei brasileira, também podiam ser comprados separadamente, de acordo com o estoque de cada loja.</w:t>
       </w:r>
     </w:p>
     <w:p>
@@ -2814,7 +2814,7 @@
         <w:t>▶ PÁGINA 5 do slide</w:t>
       </w:r>
       <w:r>
-        <w:t xml:space="preserve"> · 6 bonecos = 6 visitas</w:t>
+        <w:t xml:space="preserve"> · 6 bonecos = mais vendas · leva os 6 de uma vez (ticket maior) × volta várias vezes (recorrência)</w:t>
       </w:r>
     </w:p>
     <w:p>
@@ -2824,7 +2824,17 @@
     </w:p>
     <w:p>
       <w:r>
-        <w:t>Quem quer a coleção completa volta seis vezes. Isso transforma uma compra em recorrência. Colecionável é uma estratégia antiga, e continua funcionando muito bem.</w:t>
+        <w:t>E aqui tem um ponto importante: quem quiser pode levar os seis de uma vez, fazendo seis pedidos ou comprando os bonecos separados no balcão. Não precisa voltar seis vezes.</w:t>
+      </w:r>
+    </w:p>
+    <w:p>
+      <w:r>
+        <w:t>Mas olha que interessante: nos dois casos, o Burger King ganha. Quem leva os seis de uma vez aumenta o ticket, ou seja, gasta muito mais numa única compra do que gastaria num lanche. E quem vai comprando aos poucos volta várias vezes, e isso é recorrência. E, se o boneco que a pessoa quer acabou naquela loja, ela volta outro dia ou vai atrás em outra unidade.</w:t>
+      </w:r>
+    </w:p>
+    <w:p>
+      <w:r>
+        <w:t>Colecionável é uma estratégia antiga e continua funcionando muito bem. Ninguém quer ficar com a coleção incompleta.</w:t>
       </w:r>
     </w:p>
     <w:p>
@@ -2858,27 +2868,17 @@
         <w:t>▶ PÁGINA 7 do slide</w:t>
       </w:r>
       <w:r>
-        <w:t xml:space="preserve"> · Como adaptar ao seu negócio</w:t>
-      </w:r>
-    </w:p>
-    <w:p>
-      <w:r>
-        <w:t>"Tá, Amanda, mas eu não sou o Burger King. Eu não tenho parceria com a Toei."</w:t>
-      </w:r>
-    </w:p>
-    <w:p>
-      <w:r>
-        <w:t>E você não precisa. A estratégia é a mesma em qualquer tamanho. A pergunta é: qual era o desenho, a música, o doce, a novela ou a brincadeira da infância do seu cliente?</w:t>
-      </w:r>
-    </w:p>
-    <w:p>
-      <w:r>
-        <w:t>Uma loja de roupas pode criar uma coleção com a estética dos anos 2000. Uma doceria pode trazer de volta o doce que vendia na porta da escola. Um restaurante pode ter o "prato da casa da vó". Uma consultoria pode usar referências de filmes ou séries que o público ama para explicar conceitos.</w:t>
-      </w:r>
-    </w:p>
-    <w:p>
-      <w:r>
-        <w:t>E dá para usar o colecionável também: um cartão fidelidade com carimbos temáticos, uma série de embalagens diferentes, uma coleção limitada.</w:t>
+        <w:t xml:space="preserve"> · Memória afetiva não é só infância</w:t>
+      </w:r>
+    </w:p>
+    <w:p>
+      <w:r>
+        <w:t>"Tá, Amanda, mas e se o meu cliente não liga para desenho animado?"</w:t>
+      </w:r>
+    </w:p>
+    <w:p>
+      <w:r>
+        <w:t>Memória afetiva não é só infância. É qualquer lembrança que carrega uma emoção boa. E ela entra pelos sentidos e pelos momentos marcantes da vida. Vou te mostrar os dois caminhos.</w:t>
       </w:r>
     </w:p>
     <w:p>
@@ -2890,12 +2890,138 @@
         <w:t>▶ PÁGINA 8 do slide</w:t>
       </w:r>
       <w:r>
+        <w:t xml:space="preserve"> · Pelos 5 sentidos · paladar · olfato · tato · audição · visão</w:t>
+      </w:r>
+    </w:p>
+    <w:p>
+      <w:r>
+        <w:t>O primeiro caminho: os cinco sentidos.</w:t>
+      </w:r>
+    </w:p>
+    <w:p>
+      <w:r>
+        <w:t>O paladar: o bolo que a mãe fazia, ou aquele prato que você comeu numa viagem e nunca mais esqueceu. Um restaurante pode contar a história do prato que nasceu numa viagem. Uma doceria pode ter "o bolo de domingo".</w:t>
+      </w:r>
+    </w:p>
+    <w:p>
+      <w:r>
+        <w:t>O olfato: o cheiro é um dos atalhos mais rápidos para a memória. As lojas de perfumaria, como O Boticário, perfumam a entrada, e quem passa na porta sente o cheiro da marca. A padaria que tira o pão do forno no fim da tarde faz a mesma coisa. Um salão, uma clínica, uma pousada ou uma loja de roupas podem ter um aroma próprio, que o cliente reconhece de olhos fechados.</w:t>
+      </w:r>
+    </w:p>
+    <w:p>
+      <w:r>
+        <w:t>O tato: a textura do tecido que o cliente toca na loja, a toalha macia do hotel, a embalagem caprichada, com papel de seda e laço. O toque faz a pessoa lembrar da experiência.</w:t>
+      </w:r>
+    </w:p>
+    <w:p>
+      <w:r>
+        <w:t>A audição: a música que tocava na formatura, no casamento, nas festas da adolescência. Uma playlist da loja ou um som no vídeo podem levar o cliente de volta para aquele momento.</w:t>
+      </w:r>
+    </w:p>
+    <w:p>
+      <w:r>
+        <w:t>E a visão: uma estética de outra época, como as fotos de câmera antiga e as cores dos anos 90 ou 2000.</w:t>
+      </w:r>
+    </w:p>
+    <w:p>
+      <w:r>
+        <w:t>E, no Instagram, você também ativa os sentidos: com um vídeo bem de perto da calda escorrendo, com o som do crocante, ou com uma legenda que descreve o cheiro.</w:t>
+      </w:r>
+    </w:p>
+    <w:p>
+      <w:r>
+        <w:rPr>
+          <w:b/>
+          <w:color w:val="5A4412"/>
+        </w:rPr>
+        <w:t>▶ PÁGINA 9 do slide</w:t>
+      </w:r>
+      <w:r>
+        <w:t xml:space="preserve"> · Pelos momentos marcantes · a primeira casa · o casamento e a formatura · aquela viagem · os rituais de família · a adolescência · as datas do ano</w:t>
+      </w:r>
+    </w:p>
+    <w:p>
+      <w:r>
+        <w:t>O segundo caminho: os momentos marcantes da vida, de qualquer idade.</w:t>
+      </w:r>
+    </w:p>
+    <w:p>
+      <w:r>
+        <w:t>A primeira casa: uma imobiliária ou uma loja de móveis pode falar do cheiro de casa nova e da primeira noite no próprio canto.</w:t>
+      </w:r>
+    </w:p>
+    <w:p>
+      <w:r>
+        <w:t>O casamento e a formatura: um fotógrafo, um buffet ou um salão de beleza trabalham com essa memória o tempo todo.</w:t>
+      </w:r>
+    </w:p>
+    <w:p>
+      <w:r>
+        <w:t>Aquela viagem: uma agência de turismo, um restaurante ou uma loja de decoração podem trazer de volta o lugar que o cliente nunca esqueceu.</w:t>
+      </w:r>
+    </w:p>
+    <w:p>
+      <w:r>
+        <w:t>Os rituais de família: o café da tarde na casa da vó, o almoço de domingo, a ceia de Natal.</w:t>
+      </w:r>
+    </w:p>
+    <w:p>
+      <w:r>
+        <w:t>A adolescência: as músicas, as roupas, as séries. Uma loja de roupas pode criar uma coleção com a estética dos anos 2000.</w:t>
+      </w:r>
+    </w:p>
+    <w:p>
+      <w:r>
+        <w:t>E as datas do ano: a festa junina, o Natal, a volta às aulas. Toda data comercial tem uma memória afetiva junto.</w:t>
+      </w:r>
+    </w:p>
+    <w:p>
+      <w:r>
+        <w:rPr>
+          <w:b/>
+          <w:color w:val="5A4412"/>
+        </w:rPr>
+        <w:t>▶ PÁGINA 10 do slide</w:t>
+      </w:r>
+      <w:r>
+        <w:t xml:space="preserve"> · Como adaptar ao seu negócio</w:t>
+      </w:r>
+    </w:p>
+    <w:p>
+      <w:r>
+        <w:t>"Tá, Amanda, mas eu não sou o Burger King. Eu não tenho parceria com a Toei."</w:t>
+      </w:r>
+    </w:p>
+    <w:p>
+      <w:r>
+        <w:t>E você não precisa. A estratégia é a mesma em qualquer tamanho. A pergunta é: qual memória boa o seu cliente tem que combina com o que você vende?</w:t>
+      </w:r>
+    </w:p>
+    <w:p>
+      <w:r>
+        <w:t>Uma doceria pode trazer de volta o doce que vendia na porta da escola. Um restaurante pode ter o "prato da casa da vó". Uma consultoria pode usar referências de filmes ou séries que o público ama para explicar conceitos.</w:t>
+      </w:r>
+    </w:p>
+    <w:p>
+      <w:r>
+        <w:t>E dá para usar o colecionável também: um cartão fidelidade com carimbos temáticos, uma série de embalagens diferentes, uma coleção limitada.</w:t>
+      </w:r>
+    </w:p>
+    <w:p>
+      <w:r>
+        <w:rPr>
+          <w:b/>
+          <w:color w:val="5A4412"/>
+        </w:rPr>
+        <w:t>▶ PÁGINA 11 do slide</w:t>
+      </w:r>
+      <w:r>
         <w:t xml:space="preserve"> · Atividade</w:t>
       </w:r>
     </w:p>
     <w:p>
       <w:r>
-        <w:t>A sua atividade: lista 3 memórias afetivas do seu público. O que ele assistia, ouvia, comia ou fazia na infância ou na adolescência. E, para cada uma, escreve uma ideia de conteúdo ou de ação para o seu negócio.</w:t>
+        <w:t>A sua atividade: liste 3 memórias afetivas do seu público. Pode ser da infância, de um sentido, como um cheiro ou um sabor, ou de um momento marcante da vida. E, para cada uma, escreva uma ideia de conteúdo ou de ação para o seu negócio.</w:t>
       </w:r>
     </w:p>
     <w:p>

</xml_diff>

<commit_message>
Recria Ads: aula 1.4 com os vídeos do anúncio oficial e da experiência completa
Co-Authored-By: Claude Opus 5.5 <noreply@anthropic.com>
Claude-Session: https://claude.ai/code/session_01RDM8d5cVD9w4uwiMSyLkgt
</commit_message>
<xml_diff>
--- a/agencia-recria/cursos/recria-ads/para-ler-e-gravar/Roteiros - Modulos 0 a 2.docx
+++ b/agencia-recria/cursos/recria-ads/para-ler-e-gravar/Roteiros - Modulos 0 a 2.docx
@@ -714,7 +714,7 @@
           <w:p>
             <w:r/>
             <w:r>
-              <w:t>9 min</w:t>
+              <w:t>9 a 10 min</w:t>
             </w:r>
           </w:p>
         </w:tc>
@@ -2697,7 +2697,7 @@
         <w:t>Duração:</w:t>
       </w:r>
       <w:r>
-        <w:t xml:space="preserve"> cerca de 9 min (máximo 10)</w:t>
+        <w:t xml:space="preserve"> cerca de 9 a 10 min (máximo 10)</w:t>
       </w:r>
     </w:p>
     <w:p>
@@ -2718,6 +2718,48 @@
           <w:b/>
           <w:color w:val="5A4412"/>
         </w:rPr>
+        <w:t>Vídeos desta aula</w:t>
+      </w:r>
+      <w:r>
+        <w:t xml:space="preserve"> (pasta "slides/videos-aula-1.4"): no Canva, coloque cada vídeo por cima da capa com o ▶ que está no slide.</w:t>
+      </w:r>
+    </w:p>
+    <w:p>
+      <w:pPr>
+        <w:pStyle w:val="ListBullet"/>
+      </w:pPr>
+      <w:r>
+        <w:rPr>
+          <w:b/>
+          <w:color w:val="5A4412"/>
+        </w:rPr>
+        <w:t>Vídeo 1 · anúncio oficial do Burger King</w:t>
+      </w:r>
+      <w:r>
+        <w:t xml:space="preserve"> (13 segundos) · página 3 · deixe tocar com som.</w:t>
+      </w:r>
+    </w:p>
+    <w:p>
+      <w:pPr>
+        <w:pStyle w:val="ListBullet"/>
+      </w:pPr>
+      <w:r>
+        <w:rPr>
+          <w:b/>
+          <w:color w:val="5A4412"/>
+        </w:rPr>
+        <w:t>Vídeo 2 · a experiência completa</w:t>
+      </w:r>
+      <w:r>
+        <w:t xml:space="preserve"> (34 segundos) · página 5 · deixe rodar sem som enquanto você narra.</w:t>
+      </w:r>
+    </w:p>
+    <w:p>
+      <w:r>
+        <w:rPr>
+          <w:b/>
+          <w:color w:val="5A4412"/>
+        </w:rPr>
         <w:t>▶ PÁGINA 1 do slide</w:t>
       </w:r>
       <w:r>
@@ -2760,22 +2802,26 @@
         <w:t>▶ PÁGINA 3 do slide</w:t>
       </w:r>
       <w:r>
-        <w:t xml:space="preserve"> · Para quem é, de verdade?</w:t>
-      </w:r>
-    </w:p>
-    <w:p>
-      <w:r>
-        <w:t>Agora eu te pergunto: para quem é essa campanha?</w:t>
-      </w:r>
-    </w:p>
-    <w:p>
-      <w:r>
-        <w:t>No papel, é um combo infantil. Mas quem você acha que correu atrás desses bonecos?</w:t>
-      </w:r>
-    </w:p>
-    <w:p>
-      <w:r>
-        <w:t>O adulto de 30 e poucos anos. Aquele que cresceu assistindo Dragon Ball na TV, depois da escola. Que brincava de soltar Kamehameha no recreio.</w:t>
+        <w:t xml:space="preserve"> · Vídeo 1 · o anúncio oficial · a coleção completa</w:t>
+      </w:r>
+    </w:p>
+    <w:p>
+      <w:r>
+        <w:t>Olha o anúncio que o Burger King fez para a coleção.</w:t>
+      </w:r>
+    </w:p>
+    <w:p>
+      <w:r>
+        <w:rPr>
+          <w:b/>
+          <w:color w:val="5A4412"/>
+        </w:rPr>
+        <w:t>[▶ Soltar o vídeo 1, com som, 13 segundos]</w:t>
+      </w:r>
+    </w:p>
+    <w:p>
+      <w:r>
+        <w:t>Repara: o Goku, o Vegeta, os dois na versão de cabelo azul, o Super Saiyajin Blue, o Piccolo e o Bills. Quem assistiu sabe o nome de cada um sem precisar ler.</w:t>
       </w:r>
     </w:p>
     <w:p>
@@ -2787,22 +2833,22 @@
         <w:t>▶ PÁGINA 4 do slide</w:t>
       </w:r>
       <w:r>
-        <w:t xml:space="preserve"> · Não é hambúrguer. É a volta à infância.</w:t>
-      </w:r>
-    </w:p>
-    <w:p>
-      <w:r>
-        <w:t>E aqui está a grande sacada: o Burger King não está vendendo hambúrguer. Está vendendo a volta à infância.</w:t>
-      </w:r>
-    </w:p>
-    <w:p>
-      <w:r>
-        <w:t>Isso é memória afetiva. Quando algo nos lembra de um momento feliz do passado, o cérebro revive aquela emoção. É o Sistema 1 funcionando no máximo, lembra da aula 1.1?</w:t>
-      </w:r>
-    </w:p>
-    <w:p>
-      <w:r>
-        <w:t>A pessoa não pensa "preciso de um hambúrguer". Ela pensa "eu PRECISO do Goku".</w:t>
+        <w:t xml:space="preserve"> · Para quem é, de verdade?</w:t>
+      </w:r>
+    </w:p>
+    <w:p>
+      <w:r>
+        <w:t>Agora eu te pergunto: para quem é essa campanha?</w:t>
+      </w:r>
+    </w:p>
+    <w:p>
+      <w:r>
+        <w:t>No papel, é um combo infantil. Mas quem você acha que correu atrás desses bonecos?</w:t>
+      </w:r>
+    </w:p>
+    <w:p>
+      <w:r>
+        <w:t>O adulto de 30 e poucos anos. Aquele que cresceu assistindo Dragon Ball na TV, depois da escola. Que brincava de soltar Kamehameha no recreio.</w:t>
       </w:r>
     </w:p>
     <w:p>
@@ -2814,27 +2860,31 @@
         <w:t>▶ PÁGINA 5 do slide</w:t>
       </w:r>
       <w:r>
-        <w:t xml:space="preserve"> · 6 bonecos = mais vendas · leva os 6 de uma vez (ticket maior) × volta várias vezes (recorrência)</w:t>
-      </w:r>
-    </w:p>
-    <w:p>
-      <w:r>
-        <w:t>E repara no segundo detalhe: são seis bonecos. Não é um.</w:t>
-      </w:r>
-    </w:p>
-    <w:p>
-      <w:r>
-        <w:t>E aqui tem um ponto importante: quem quiser pode levar os seis de uma vez, fazendo seis pedidos ou comprando os bonecos separados no balcão. Não precisa voltar seis vezes.</w:t>
-      </w:r>
-    </w:p>
-    <w:p>
-      <w:r>
-        <w:t>Mas olha que interessante: nos dois casos, o Burger King ganha. Quem leva os seis de uma vez aumenta o ticket, ou seja, gasta muito mais numa única compra do que gastaria num lanche. E quem vai comprando aos poucos volta várias vezes, e isso é recorrência. E, se o boneco que a pessoa quer acabou naquela loja, ela volta outro dia ou vai atrás em outra unidade.</w:t>
-      </w:r>
-    </w:p>
-    <w:p>
-      <w:r>
-        <w:t>Colecionável é uma estratégia antiga e continua funcionando muito bem. Ninguém quer ficar com a coleção incompleta.</w:t>
+        <w:t xml:space="preserve"> · Vídeo 2 · a experiência completa · por que mexe com quem tem 30+</w:t>
+      </w:r>
+    </w:p>
+    <w:p>
+      <w:r>
+        <w:t>E agora olha esse vídeo, mostrando a experiência completa.</w:t>
+      </w:r>
+    </w:p>
+    <w:p>
+      <w:r>
+        <w:rPr>
+          <w:b/>
+          <w:color w:val="5A4412"/>
+        </w:rPr>
+        <w:t>[▶ Soltar o vídeo 2, sem som, e narrar por cima]</w:t>
+      </w:r>
+    </w:p>
+    <w:p>
+      <w:r>
+        <w:t>Olha os detalhes. A caixa com o Goku e o Vegeta. Os bonecos saindo um por um. As bolinhas do lanche, que lembram as esferas do dragão. E, no final, a coroa com o cabelo do Goku, primeiro o preto e depois o azul.</w:t>
+      </w:r>
+    </w:p>
+    <w:p>
+      <w:r>
+        <w:t>Não é só um brinde. É a pessoa vestindo o personagem que ela assistia na TV depois da escola. Cada detalhe foi pensado para levar quem tem 30 e poucos anos de volta para aquela época.</w:t>
       </w:r>
     </w:p>
     <w:p>
@@ -2846,17 +2896,22 @@
         <w:t>▶ PÁGINA 6 do slide</w:t>
       </w:r>
       <w:r>
-        <w:t xml:space="preserve"> · O público faz o marketing</w:t>
-      </w:r>
-    </w:p>
-    <w:p>
-      <w:r>
-        <w:t>E o terceiro detalhe: quem compra posta. Foto da coleção, vídeo abrindo o boneco, stories "consegui o Vegeta!".</w:t>
-      </w:r>
-    </w:p>
-    <w:p>
-      <w:r>
-        <w:t>O público faz o marketing de graça. E cada post desses é prova social, lembra da aula 1.2?</w:t>
+        <w:t xml:space="preserve"> · Não é hambúrguer. É a volta à infância.</w:t>
+      </w:r>
+    </w:p>
+    <w:p>
+      <w:r>
+        <w:t>E aqui está a grande sacada: o Burger King não está vendendo hambúrguer. Está vendendo a volta à infância.</w:t>
+      </w:r>
+    </w:p>
+    <w:p>
+      <w:r>
+        <w:t>Isso é memória afetiva. Quando algo nos lembra de um momento feliz do passado, o cérebro revive aquela emoção. É o Sistema 1 funcionando no máximo, lembra da aula 1.1?</w:t>
+      </w:r>
+    </w:p>
+    <w:p>
+      <w:r>
+        <w:t>A pessoa não pensa "preciso de um hambúrguer". Ela pensa "eu PRECISO do Goku".</w:t>
       </w:r>
     </w:p>
     <w:p>
@@ -2868,17 +2923,27 @@
         <w:t>▶ PÁGINA 7 do slide</w:t>
       </w:r>
       <w:r>
-        <w:t xml:space="preserve"> · Memória afetiva não é só infância</w:t>
-      </w:r>
-    </w:p>
-    <w:p>
-      <w:r>
-        <w:t>"Tá, Amanda, mas e se o meu cliente não liga para desenho animado?"</w:t>
-      </w:r>
-    </w:p>
-    <w:p>
-      <w:r>
-        <w:t>Memória afetiva não é só infância. É qualquer lembrança que carrega uma emoção boa. E ela entra pelos sentidos e pelos momentos marcantes da vida. Vou te mostrar os dois caminhos.</w:t>
+        <w:t xml:space="preserve"> · 6 bonecos = mais vendas · leva os 6 de uma vez (ticket maior) × volta várias vezes (recorrência)</w:t>
+      </w:r>
+    </w:p>
+    <w:p>
+      <w:r>
+        <w:t>E repara no segundo detalhe: são seis bonecos. Não é um.</w:t>
+      </w:r>
+    </w:p>
+    <w:p>
+      <w:r>
+        <w:t>E aqui tem um ponto importante: quem quiser pode levar os seis de uma vez, fazendo seis pedidos ou comprando os bonecos separados no balcão. Não precisa voltar seis vezes.</w:t>
+      </w:r>
+    </w:p>
+    <w:p>
+      <w:r>
+        <w:t>Mas olha que interessante: nos dois casos, o Burger King ganha. Quem leva os seis de uma vez aumenta o ticket, ou seja, gasta muito mais numa única compra do que gastaria num lanche. E quem vai comprando aos poucos volta várias vezes, e isso é recorrência. E, se o boneco que a pessoa quer acabou naquela loja, ela volta outro dia ou vai atrás em outra unidade.</w:t>
+      </w:r>
+    </w:p>
+    <w:p>
+      <w:r>
+        <w:t>Colecionável é uma estratégia antiga e continua funcionando muito bem. Ninguém quer ficar com a coleção incompleta.</w:t>
       </w:r>
     </w:p>
     <w:p>
@@ -2890,42 +2955,17 @@
         <w:t>▶ PÁGINA 8 do slide</w:t>
       </w:r>
       <w:r>
-        <w:t xml:space="preserve"> · Pelos 5 sentidos · paladar · olfato · tato · audição · visão</w:t>
-      </w:r>
-    </w:p>
-    <w:p>
-      <w:r>
-        <w:t>O primeiro caminho: os cinco sentidos.</w:t>
-      </w:r>
-    </w:p>
-    <w:p>
-      <w:r>
-        <w:t>O paladar: o bolo que a mãe fazia, ou aquele prato que você comeu numa viagem e nunca mais esqueceu. Um restaurante pode contar a história do prato que nasceu numa viagem. Uma doceria pode ter "o bolo de domingo".</w:t>
-      </w:r>
-    </w:p>
-    <w:p>
-      <w:r>
-        <w:t>O olfato: o cheiro é um dos atalhos mais rápidos para a memória. As lojas de perfumaria, como O Boticário, perfumam a entrada, e quem passa na porta sente o cheiro da marca. A padaria que tira o pão do forno no fim da tarde faz a mesma coisa. Um salão, uma clínica, uma pousada ou uma loja de roupas podem ter um aroma próprio, que o cliente reconhece de olhos fechados.</w:t>
-      </w:r>
-    </w:p>
-    <w:p>
-      <w:r>
-        <w:t>O tato: a textura do tecido que o cliente toca na loja, a toalha macia do hotel, a embalagem caprichada, com papel de seda e laço. O toque faz a pessoa lembrar da experiência.</w:t>
-      </w:r>
-    </w:p>
-    <w:p>
-      <w:r>
-        <w:t>A audição: a música que tocava na formatura, no casamento, nas festas da adolescência. Uma playlist da loja ou um som no vídeo podem levar o cliente de volta para aquele momento.</w:t>
-      </w:r>
-    </w:p>
-    <w:p>
-      <w:r>
-        <w:t>E a visão: uma estética de outra época, como as fotos de câmera antiga e as cores dos anos 90 ou 2000.</w:t>
-      </w:r>
-    </w:p>
-    <w:p>
-      <w:r>
-        <w:t>E, no Instagram, você também ativa os sentidos: com um vídeo bem de perto da calda escorrendo, com o som do crocante, ou com uma legenda que descreve o cheiro.</w:t>
+        <w:t xml:space="preserve"> · O público faz o marketing</w:t>
+      </w:r>
+    </w:p>
+    <w:p>
+      <w:r>
+        <w:t>E o terceiro detalhe: quem compra posta. Foto da coleção, vídeo abrindo o boneco, stories "consegui o Vegeta!".</w:t>
+      </w:r>
+    </w:p>
+    <w:p>
+      <w:r>
+        <w:t>O público faz o marketing de graça. E cada post desses é prova social, lembra da aula 1.2?</w:t>
       </w:r>
     </w:p>
     <w:p>
@@ -2937,42 +2977,17 @@
         <w:t>▶ PÁGINA 9 do slide</w:t>
       </w:r>
       <w:r>
-        <w:t xml:space="preserve"> · Pelos momentos marcantes · a primeira casa · o casamento e a formatura · aquela viagem · os rituais de família · a adolescência · as datas do ano</w:t>
-      </w:r>
-    </w:p>
-    <w:p>
-      <w:r>
-        <w:t>O segundo caminho: os momentos marcantes da vida, de qualquer idade.</w:t>
-      </w:r>
-    </w:p>
-    <w:p>
-      <w:r>
-        <w:t>A primeira casa: uma imobiliária ou uma loja de móveis pode falar do cheiro de casa nova e da primeira noite no próprio canto.</w:t>
-      </w:r>
-    </w:p>
-    <w:p>
-      <w:r>
-        <w:t>O casamento e a formatura: um fotógrafo, um buffet ou um salão de beleza trabalham com essa memória o tempo todo.</w:t>
-      </w:r>
-    </w:p>
-    <w:p>
-      <w:r>
-        <w:t>Aquela viagem: uma agência de turismo, um restaurante ou uma loja de decoração podem trazer de volta o lugar que o cliente nunca esqueceu.</w:t>
-      </w:r>
-    </w:p>
-    <w:p>
-      <w:r>
-        <w:t>Os rituais de família: o café da tarde na casa da vó, o almoço de domingo, a ceia de Natal.</w:t>
-      </w:r>
-    </w:p>
-    <w:p>
-      <w:r>
-        <w:t>A adolescência: as músicas, as roupas, as séries. Uma loja de roupas pode criar uma coleção com a estética dos anos 2000.</w:t>
-      </w:r>
-    </w:p>
-    <w:p>
-      <w:r>
-        <w:t>E as datas do ano: a festa junina, o Natal, a volta às aulas. Toda data comercial tem uma memória afetiva junto.</w:t>
+        <w:t xml:space="preserve"> · Memória afetiva não é só infância</w:t>
+      </w:r>
+    </w:p>
+    <w:p>
+      <w:r>
+        <w:t>"Tá, Amanda, mas e se o meu cliente não liga para desenho animado?"</w:t>
+      </w:r>
+    </w:p>
+    <w:p>
+      <w:r>
+        <w:t>Memória afetiva não é só infância. É qualquer lembrança que carrega uma emoção boa. E ela entra pelos sentidos e pelos momentos marcantes da vida. Vou te mostrar os dois caminhos.</w:t>
       </w:r>
     </w:p>
     <w:p>
@@ -2984,27 +2999,42 @@
         <w:t>▶ PÁGINA 10 do slide</w:t>
       </w:r>
       <w:r>
-        <w:t xml:space="preserve"> · Como adaptar ao seu negócio</w:t>
-      </w:r>
-    </w:p>
-    <w:p>
-      <w:r>
-        <w:t>"Tá, Amanda, mas eu não sou o Burger King. Eu não tenho parceria com a Toei."</w:t>
-      </w:r>
-    </w:p>
-    <w:p>
-      <w:r>
-        <w:t>E você não precisa. A estratégia é a mesma em qualquer tamanho. A pergunta é: qual memória boa o seu cliente tem que combina com o que você vende?</w:t>
-      </w:r>
-    </w:p>
-    <w:p>
-      <w:r>
-        <w:t>Uma doceria pode trazer de volta o doce que vendia na porta da escola. Um restaurante pode ter o "prato da casa da vó". Uma consultoria pode usar referências de filmes ou séries que o público ama para explicar conceitos.</w:t>
-      </w:r>
-    </w:p>
-    <w:p>
-      <w:r>
-        <w:t>E dá para usar o colecionável também: um cartão fidelidade com carimbos temáticos, uma série de embalagens diferentes, uma coleção limitada.</w:t>
+        <w:t xml:space="preserve"> · Pelos 5 sentidos · paladar · olfato · tato · audição · visão</w:t>
+      </w:r>
+    </w:p>
+    <w:p>
+      <w:r>
+        <w:t>O primeiro caminho: os cinco sentidos.</w:t>
+      </w:r>
+    </w:p>
+    <w:p>
+      <w:r>
+        <w:t>O paladar: o bolo que a mãe fazia, ou aquele prato que você comeu numa viagem e nunca mais esqueceu. Um restaurante pode contar a história do prato que nasceu numa viagem. Uma doceria pode ter "o bolo de domingo".</w:t>
+      </w:r>
+    </w:p>
+    <w:p>
+      <w:r>
+        <w:t>O olfato: o cheiro é um dos atalhos mais rápidos para a memória. As lojas de perfumaria, como O Boticário, perfumam a entrada, e quem passa na porta sente o cheiro da marca. A padaria que tira o pão do forno no fim da tarde faz a mesma coisa. Um salão, uma clínica, uma pousada ou uma loja de roupas podem ter um aroma próprio, que o cliente reconhece de olhos fechados.</w:t>
+      </w:r>
+    </w:p>
+    <w:p>
+      <w:r>
+        <w:t>O tato: a textura do tecido que o cliente toca na loja, a toalha macia do hotel, a embalagem caprichada, com papel de seda e laço. O toque faz a pessoa lembrar da experiência.</w:t>
+      </w:r>
+    </w:p>
+    <w:p>
+      <w:r>
+        <w:t>A audição: a música que tocava na formatura, no casamento, nas festas da adolescência. Uma playlist da loja ou um som no vídeo podem levar o cliente de volta para aquele momento.</w:t>
+      </w:r>
+    </w:p>
+    <w:p>
+      <w:r>
+        <w:t>E a visão: uma estética de outra época, como as fotos de câmera antiga e as cores dos anos 90 ou 2000.</w:t>
+      </w:r>
+    </w:p>
+    <w:p>
+      <w:r>
+        <w:t>E, no Instagram, você também ativa os sentidos: com um vídeo bem de perto da calda escorrendo, com o som do crocante, ou com uma legenda que descreve o cheiro.</w:t>
       </w:r>
     </w:p>
     <w:p>
@@ -3014,6 +3044,80 @@
           <w:color w:val="5A4412"/>
         </w:rPr>
         <w:t>▶ PÁGINA 11 do slide</w:t>
+      </w:r>
+      <w:r>
+        <w:t xml:space="preserve"> · Pelos momentos marcantes · a primeira casa · o casamento e a formatura · aquela viagem · os rituais de família · a adolescência · as datas do ano</w:t>
+      </w:r>
+    </w:p>
+    <w:p>
+      <w:r>
+        <w:t>O segundo caminho: os momentos marcantes da vida, de qualquer idade.</w:t>
+      </w:r>
+    </w:p>
+    <w:p>
+      <w:r>
+        <w:t>A primeira casa: uma imobiliária ou uma loja de móveis pode falar do cheiro de casa nova e da primeira noite no próprio canto.</w:t>
+      </w:r>
+    </w:p>
+    <w:p>
+      <w:r>
+        <w:t>O casamento e a formatura: um fotógrafo, um buffet ou um salão de beleza trabalham com essa memória o tempo todo.</w:t>
+      </w:r>
+    </w:p>
+    <w:p>
+      <w:r>
+        <w:t>Aquela viagem: uma agência de turismo, um restaurante ou uma loja de decoração podem trazer de volta o lugar que o cliente nunca esqueceu.</w:t>
+      </w:r>
+    </w:p>
+    <w:p>
+      <w:r>
+        <w:t>Os rituais de família: o café da tarde na casa da vó, o almoço de domingo, a ceia de Natal.</w:t>
+      </w:r>
+    </w:p>
+    <w:p>
+      <w:r>
+        <w:t>A adolescência: as músicas, as roupas, as séries. Uma loja de roupas pode criar uma coleção com a estética dos anos 2000.</w:t>
+      </w:r>
+    </w:p>
+    <w:p>
+      <w:r>
+        <w:t>E as datas do ano: a festa junina, o Natal, a volta às aulas. Toda data comercial tem uma memória afetiva junto.</w:t>
+      </w:r>
+    </w:p>
+    <w:p>
+      <w:r>
+        <w:rPr>
+          <w:b/>
+          <w:color w:val="5A4412"/>
+        </w:rPr>
+        <w:t>▶ PÁGINA 12 do slide</w:t>
+      </w:r>
+      <w:r>
+        <w:t xml:space="preserve"> · Como adaptar ao seu negócio</w:t>
+      </w:r>
+    </w:p>
+    <w:p>
+      <w:r>
+        <w:t>"Tá, Amanda, mas eu não sou o Burger King. Eu não tenho parceria com a Toei."</w:t>
+      </w:r>
+    </w:p>
+    <w:p>
+      <w:r>
+        <w:t>E você não precisa. A estratégia é a mesma em qualquer tamanho. A pergunta é: qual memória boa o seu cliente tem que combina com o que você vende?</w:t>
+      </w:r>
+    </w:p>
+    <w:p>
+      <w:r>
+        <w:t>E dá para usar o colecionável também: um cartão fidelidade com carimbos temáticos, uma série de embalagens diferentes, uma coleção limitada.</w:t>
+      </w:r>
+    </w:p>
+    <w:p>
+      <w:r>
+        <w:rPr>
+          <w:b/>
+          <w:color w:val="5A4412"/>
+        </w:rPr>
+        <w:t>▶ PÁGINA 13 do slide</w:t>
       </w:r>
       <w:r>
         <w:t xml:space="preserve"> · Atividade</w:t>

</xml_diff>